<commit_message>
docs: add prerequisite notes for quota group - must pre-exist
- Add Prerequisites section to QuotaGroup-Planning-Movement-Flow.md and RTF
- Clarify that quota groups must be created in Azure Portal before plan/apply
- Add required permissions list (Quota API, Resource Graph, Compute)
- Add warning banner in README before Plan Quota Movements examples
- Regenerate DOCX from updated RTF with prerequisite information
- Addresses: quota group creation is manual, script does not auto-create
</commit_message>
<xml_diff>
--- a/docs/QuotaGroup-Planning-Movement-Flow.docx
+++ b/docs/QuotaGroup-Planning-Movement-Flow.docx
@@ -813,48 +813,7 @@
           <w:bCs/>
           <w:kern w:val="0"/>
         </w:rPr>
-        <w:t>Hourly Baseline Capture</w:t>
-      </w:r>
-    </w:p>
-    <w:p>
-      <w:pPr>
-        <w:widowControl w:val="0"/>
-        <w:autoSpaceDE w:val="0"/>
-        <w:autoSpaceDN w:val="0"/>
-        <w:adjustRightInd w:val="0"/>
-        <w:spacing w:after="0" w:line="240" w:lineRule="auto"/>
-        <w:rPr>
-          <w:rFonts w:ascii="Calibri" w:hAnsi="Calibri" w:cs="Calibri"/>
-          <w:kern w:val="0"/>
-        </w:rPr>
-      </w:pPr>
-      <w:r>
-        <w:rPr>
-          <w:rFonts w:ascii="Calibri" w:hAnsi="Calibri" w:cs="Calibri"/>
-          <w:kern w:val="0"/>
-        </w:rPr>
-        <w:lastRenderedPageBreak/>
-        <w:t>Run:</w:t>
-      </w:r>
-    </w:p>
-    <w:p>
-      <w:pPr>
-        <w:widowControl w:val="0"/>
-        <w:autoSpaceDE w:val="0"/>
-        <w:autoSpaceDN w:val="0"/>
-        <w:adjustRightInd w:val="0"/>
-        <w:spacing w:after="0" w:line="240" w:lineRule="auto"/>
-        <w:rPr>
-          <w:rFonts w:ascii="Calibri" w:hAnsi="Calibri" w:cs="Calibri"/>
-          <w:kern w:val="0"/>
-        </w:rPr>
-      </w:pPr>
-      <w:r>
-        <w:rPr>
-          <w:rFonts w:ascii="Calibri" w:hAnsi="Calibri" w:cs="Calibri"/>
-          <w:kern w:val="0"/>
-        </w:rPr>
-        <w:t>.AzVMAvailability.ps1 -NoPrompt -AllSubscriptions -RegionPreset USMajor -CaptureQuotaHistory -QuotaGroupCandidates</w:t>
+        <w:t>Prerequisites</w:t>
       </w:r>
     </w:p>
     <w:p>
@@ -889,100 +848,127 @@
           <w:bCs/>
           <w:kern w:val="0"/>
         </w:rPr>
-        <w:t>Discover and Plan</w:t>
-      </w:r>
-    </w:p>
-    <w:p>
-      <w:pPr>
-        <w:widowControl w:val="0"/>
-        <w:autoSpaceDE w:val="0"/>
-        <w:autoSpaceDN w:val="0"/>
-        <w:adjustRightInd w:val="0"/>
-        <w:spacing w:after="0" w:line="240" w:lineRule="auto"/>
-        <w:rPr>
-          <w:rFonts w:ascii="Calibri" w:hAnsi="Calibri" w:cs="Calibri"/>
-          <w:kern w:val="0"/>
-        </w:rPr>
-      </w:pPr>
-      <w:r>
-        <w:rPr>
-          <w:rFonts w:ascii="Calibri" w:hAnsi="Calibri" w:cs="Calibri"/>
-          <w:kern w:val="0"/>
-        </w:rPr>
-        <w:t>Run discovery:</w:t>
-      </w:r>
-    </w:p>
-    <w:p>
-      <w:pPr>
-        <w:widowControl w:val="0"/>
-        <w:autoSpaceDE w:val="0"/>
-        <w:autoSpaceDN w:val="0"/>
-        <w:adjustRightInd w:val="0"/>
-        <w:spacing w:after="0" w:line="240" w:lineRule="auto"/>
-        <w:rPr>
-          <w:rFonts w:ascii="Calibri" w:hAnsi="Calibri" w:cs="Calibri"/>
-          <w:kern w:val="0"/>
-        </w:rPr>
-      </w:pPr>
-      <w:r>
-        <w:rPr>
-          <w:rFonts w:ascii="Calibri" w:hAnsi="Calibri" w:cs="Calibri"/>
-          <w:kern w:val="0"/>
-        </w:rPr>
-        <w:t>.AzVMAvailability.ps1 -NoPrompt -AllSubscriptions -RegionPreset USMajor -CaptureQuotaHistory -QuotaGroupCandidates -QuotaGroupDiscover</w:t>
-      </w:r>
-    </w:p>
-    <w:p>
-      <w:pPr>
-        <w:widowControl w:val="0"/>
-        <w:autoSpaceDE w:val="0"/>
-        <w:autoSpaceDN w:val="0"/>
-        <w:adjustRightInd w:val="0"/>
-        <w:spacing w:after="0" w:line="240" w:lineRule="auto"/>
-        <w:rPr>
-          <w:rFonts w:ascii="Calibri" w:hAnsi="Calibri" w:cs="Calibri"/>
-          <w:kern w:val="0"/>
-        </w:rPr>
-      </w:pPr>
-    </w:p>
-    <w:p>
-      <w:pPr>
-        <w:widowControl w:val="0"/>
-        <w:autoSpaceDE w:val="0"/>
-        <w:autoSpaceDN w:val="0"/>
-        <w:adjustRightInd w:val="0"/>
-        <w:spacing w:after="0" w:line="240" w:lineRule="auto"/>
-        <w:rPr>
-          <w:rFonts w:ascii="Calibri" w:hAnsi="Calibri" w:cs="Calibri"/>
-          <w:kern w:val="0"/>
-        </w:rPr>
-      </w:pPr>
-      <w:r>
-        <w:rPr>
-          <w:rFonts w:ascii="Calibri" w:hAnsi="Calibri" w:cs="Calibri"/>
-          <w:kern w:val="0"/>
-        </w:rPr>
-        <w:t>Generate plan:</w:t>
-      </w:r>
-    </w:p>
-    <w:p>
-      <w:pPr>
-        <w:widowControl w:val="0"/>
-        <w:autoSpaceDE w:val="0"/>
-        <w:autoSpaceDN w:val="0"/>
-        <w:adjustRightInd w:val="0"/>
-        <w:spacing w:after="0" w:line="240" w:lineRule="auto"/>
-        <w:rPr>
-          <w:rFonts w:ascii="Calibri" w:hAnsi="Calibri" w:cs="Calibri"/>
-          <w:kern w:val="0"/>
-        </w:rPr>
-      </w:pPr>
-      <w:r>
-        <w:rPr>
-          <w:rFonts w:ascii="Calibri" w:hAnsi="Calibri" w:cs="Calibri"/>
-          <w:kern w:val="0"/>
-        </w:rPr>
-        <w:t>.AzVMAvailability.ps1 -NoPrompt -AllSubscriptions -RegionPreset USMajor -QuotaGroupCandidates -QuotaGroupPlan -QuotaGroupManagementGroupId &lt;management-group-id&gt; -QuotaGroupName &lt;quota-group-name&gt;</w:t>
+        <w:t>Quota Group Must Pre-Exist</w:t>
+      </w:r>
+    </w:p>
+    <w:p>
+      <w:pPr>
+        <w:widowControl w:val="0"/>
+        <w:autoSpaceDE w:val="0"/>
+        <w:autoSpaceDN w:val="0"/>
+        <w:adjustRightInd w:val="0"/>
+        <w:spacing w:after="0" w:line="240" w:lineRule="auto"/>
+        <w:rPr>
+          <w:rFonts w:ascii="Calibri" w:hAnsi="Calibri" w:cs="Calibri"/>
+          <w:kern w:val="0"/>
+        </w:rPr>
+      </w:pPr>
+      <w:r>
+        <w:rPr>
+          <w:rFonts w:ascii="Calibri" w:hAnsi="Calibri" w:cs="Calibri"/>
+          <w:kern w:val="0"/>
+        </w:rPr>
+        <w:t>The script does NOT create quota groups. You must create the allocation group in Azure Portal before running plan/apply operations.</w:t>
+      </w:r>
+    </w:p>
+    <w:p>
+      <w:pPr>
+        <w:widowControl w:val="0"/>
+        <w:autoSpaceDE w:val="0"/>
+        <w:autoSpaceDN w:val="0"/>
+        <w:adjustRightInd w:val="0"/>
+        <w:spacing w:after="0" w:line="240" w:lineRule="auto"/>
+        <w:rPr>
+          <w:rFonts w:ascii="Calibri" w:hAnsi="Calibri" w:cs="Calibri"/>
+          <w:kern w:val="0"/>
+        </w:rPr>
+      </w:pPr>
+      <w:r>
+        <w:rPr>
+          <w:rFonts w:ascii="Calibri" w:hAnsi="Calibri" w:cs="Calibri"/>
+          <w:kern w:val="0"/>
+        </w:rPr>
+        <w:t>- Navigate to Azure Portal &gt; Quotas &gt; My quotas &gt; Group quotas</w:t>
+      </w:r>
+    </w:p>
+    <w:p>
+      <w:pPr>
+        <w:widowControl w:val="0"/>
+        <w:autoSpaceDE w:val="0"/>
+        <w:autoSpaceDN w:val="0"/>
+        <w:adjustRightInd w:val="0"/>
+        <w:spacing w:after="0" w:line="240" w:lineRule="auto"/>
+        <w:rPr>
+          <w:rFonts w:ascii="Calibri" w:hAnsi="Calibri" w:cs="Calibri"/>
+          <w:kern w:val="0"/>
+        </w:rPr>
+      </w:pPr>
+      <w:r>
+        <w:rPr>
+          <w:rFonts w:ascii="Calibri" w:hAnsi="Calibri" w:cs="Calibri"/>
+          <w:kern w:val="0"/>
+        </w:rPr>
+        <w:t>- Click Create quota group</w:t>
+      </w:r>
+    </w:p>
+    <w:p>
+      <w:pPr>
+        <w:widowControl w:val="0"/>
+        <w:autoSpaceDE w:val="0"/>
+        <w:autoSpaceDN w:val="0"/>
+        <w:adjustRightInd w:val="0"/>
+        <w:spacing w:after="0" w:line="240" w:lineRule="auto"/>
+        <w:rPr>
+          <w:rFonts w:ascii="Calibri" w:hAnsi="Calibri" w:cs="Calibri"/>
+          <w:kern w:val="0"/>
+        </w:rPr>
+      </w:pPr>
+      <w:r>
+        <w:rPr>
+          <w:rFonts w:ascii="Calibri" w:hAnsi="Calibri" w:cs="Calibri"/>
+          <w:kern w:val="0"/>
+        </w:rPr>
+        <w:t>- Assign subscriptions to the group</w:t>
+      </w:r>
+    </w:p>
+    <w:p>
+      <w:pPr>
+        <w:widowControl w:val="0"/>
+        <w:autoSpaceDE w:val="0"/>
+        <w:autoSpaceDN w:val="0"/>
+        <w:adjustRightInd w:val="0"/>
+        <w:spacing w:after="0" w:line="240" w:lineRule="auto"/>
+        <w:rPr>
+          <w:rFonts w:ascii="Calibri" w:hAnsi="Calibri" w:cs="Calibri"/>
+          <w:kern w:val="0"/>
+        </w:rPr>
+      </w:pPr>
+      <w:r>
+        <w:rPr>
+          <w:rFonts w:ascii="Calibri" w:hAnsi="Calibri" w:cs="Calibri"/>
+          <w:kern w:val="0"/>
+        </w:rPr>
+        <w:t>- Note the group name and management group ID</w:t>
+      </w:r>
+    </w:p>
+    <w:p>
+      <w:pPr>
+        <w:widowControl w:val="0"/>
+        <w:autoSpaceDE w:val="0"/>
+        <w:autoSpaceDN w:val="0"/>
+        <w:adjustRightInd w:val="0"/>
+        <w:spacing w:after="0" w:line="240" w:lineRule="auto"/>
+        <w:rPr>
+          <w:rFonts w:ascii="Calibri" w:hAnsi="Calibri" w:cs="Calibri"/>
+          <w:kern w:val="0"/>
+        </w:rPr>
+      </w:pPr>
+      <w:r>
+        <w:rPr>
+          <w:rFonts w:ascii="Calibri" w:hAnsi="Calibri" w:cs="Calibri"/>
+          <w:kern w:val="0"/>
+        </w:rPr>
+        <w:t>Use these values with -QuotaGroupName and -QuotaGroupManagementGroupId in plan/apply commands.</w:t>
       </w:r>
     </w:p>
     <w:p>
@@ -1017,167 +1003,67 @@
           <w:bCs/>
           <w:kern w:val="0"/>
         </w:rPr>
-        <w:t>Apply and Verify</w:t>
-      </w:r>
-    </w:p>
-    <w:p>
-      <w:pPr>
-        <w:widowControl w:val="0"/>
-        <w:autoSpaceDE w:val="0"/>
-        <w:autoSpaceDN w:val="0"/>
-        <w:adjustRightInd w:val="0"/>
-        <w:spacing w:after="0" w:line="240" w:lineRule="auto"/>
-        <w:rPr>
-          <w:rFonts w:ascii="Calibri" w:hAnsi="Calibri" w:cs="Calibri"/>
-          <w:kern w:val="0"/>
-        </w:rPr>
-      </w:pPr>
-      <w:r>
-        <w:rPr>
-          <w:rFonts w:ascii="Calibri" w:hAnsi="Calibri" w:cs="Calibri"/>
-          <w:kern w:val="0"/>
-        </w:rPr>
-        <w:t>Apply from script plan:</w:t>
-      </w:r>
-    </w:p>
-    <w:p>
-      <w:pPr>
-        <w:widowControl w:val="0"/>
-        <w:autoSpaceDE w:val="0"/>
-        <w:autoSpaceDN w:val="0"/>
-        <w:adjustRightInd w:val="0"/>
-        <w:spacing w:after="0" w:line="240" w:lineRule="auto"/>
-        <w:rPr>
-          <w:rFonts w:ascii="Calibri" w:hAnsi="Calibri" w:cs="Calibri"/>
-          <w:kern w:val="0"/>
-        </w:rPr>
-      </w:pPr>
-      <w:r>
-        <w:rPr>
-          <w:rFonts w:ascii="Calibri" w:hAnsi="Calibri" w:cs="Calibri"/>
-          <w:kern w:val="0"/>
-        </w:rPr>
-        <w:t>.AzVMAvailability.ps1 -NoPrompt -AllSubscriptions -RegionPreset USMajor -QuotaGroupCandidates -QuotaGroupPlan -QuotaGroupApply -QuotaGroupForceConfirm -QuotaGroupManagementGroupId &lt;management-group-id&gt; -QuotaGroupName &lt;quota-group-name&gt;</w:t>
-      </w:r>
-    </w:p>
-    <w:p>
-      <w:pPr>
-        <w:widowControl w:val="0"/>
-        <w:autoSpaceDE w:val="0"/>
-        <w:autoSpaceDN w:val="0"/>
-        <w:adjustRightInd w:val="0"/>
-        <w:spacing w:after="0" w:line="240" w:lineRule="auto"/>
-        <w:rPr>
-          <w:rFonts w:ascii="Calibri" w:hAnsi="Calibri" w:cs="Calibri"/>
-          <w:kern w:val="0"/>
-        </w:rPr>
-      </w:pPr>
-    </w:p>
-    <w:p>
-      <w:pPr>
-        <w:widowControl w:val="0"/>
-        <w:autoSpaceDE w:val="0"/>
-        <w:autoSpaceDN w:val="0"/>
-        <w:adjustRightInd w:val="0"/>
-        <w:spacing w:after="0" w:line="240" w:lineRule="auto"/>
-        <w:rPr>
-          <w:rFonts w:ascii="Calibri" w:hAnsi="Calibri" w:cs="Calibri"/>
-          <w:kern w:val="0"/>
-        </w:rPr>
-      </w:pPr>
-      <w:r>
-        <w:rPr>
-          <w:rFonts w:ascii="Calibri" w:hAnsi="Calibri" w:cs="Calibri"/>
-          <w:kern w:val="0"/>
-        </w:rPr>
-        <w:t>Direct API paths:</w:t>
-      </w:r>
-    </w:p>
-    <w:p>
-      <w:pPr>
-        <w:widowControl w:val="0"/>
-        <w:autoSpaceDE w:val="0"/>
-        <w:autoSpaceDN w:val="0"/>
-        <w:adjustRightInd w:val="0"/>
-        <w:spacing w:after="0" w:line="240" w:lineRule="auto"/>
-        <w:rPr>
-          <w:rFonts w:ascii="Calibri" w:hAnsi="Calibri" w:cs="Calibri"/>
-          <w:kern w:val="0"/>
-        </w:rPr>
-      </w:pPr>
-      <w:r>
-        <w:rPr>
-          <w:rFonts w:ascii="Calibri" w:hAnsi="Calibri" w:cs="Calibri"/>
-          <w:kern w:val="0"/>
-        </w:rPr>
-        <w:t>GET .../quotaAllocations/location?api-version=2025-09-01</w:t>
-      </w:r>
-    </w:p>
-    <w:p>
-      <w:pPr>
-        <w:widowControl w:val="0"/>
-        <w:autoSpaceDE w:val="0"/>
-        <w:autoSpaceDN w:val="0"/>
-        <w:adjustRightInd w:val="0"/>
-        <w:spacing w:after="0" w:line="240" w:lineRule="auto"/>
-        <w:rPr>
-          <w:rFonts w:ascii="Calibri" w:hAnsi="Calibri" w:cs="Calibri"/>
-          <w:kern w:val="0"/>
-        </w:rPr>
-      </w:pPr>
-      <w:r>
-        <w:rPr>
-          <w:rFonts w:ascii="Calibri" w:hAnsi="Calibri" w:cs="Calibri"/>
-          <w:kern w:val="0"/>
-        </w:rPr>
-        <w:t>PATCH .../quotaAllocations/location</w:t>
-      </w:r>
-      <w:r>
-        <w:rPr>
-          <w:rFonts w:ascii="Calibri" w:hAnsi="Calibri" w:cs="Calibri"/>
-          <w:kern w:val="0"/>
-        </w:rPr>
-        <w:t>?api-version=2025-09-01</w:t>
-      </w:r>
-    </w:p>
-    <w:p>
-      <w:pPr>
-        <w:widowControl w:val="0"/>
-        <w:autoSpaceDE w:val="0"/>
-        <w:autoSpaceDN w:val="0"/>
-        <w:adjustRightInd w:val="0"/>
-        <w:spacing w:after="0" w:line="240" w:lineRule="auto"/>
-        <w:rPr>
-          <w:rFonts w:ascii="Calibri" w:hAnsi="Calibri" w:cs="Calibri"/>
-          <w:kern w:val="0"/>
-        </w:rPr>
-      </w:pPr>
-      <w:r>
-        <w:rPr>
-          <w:rFonts w:ascii="Calibri" w:hAnsi="Calibri" w:cs="Calibri"/>
-          <w:kern w:val="0"/>
-        </w:rPr>
-        <w:t>GET .../quotaAllocationRequests?...&amp;$filter=location eq location</w:t>
-      </w:r>
-    </w:p>
-    <w:p>
-      <w:pPr>
-        <w:widowControl w:val="0"/>
-        <w:autoSpaceDE w:val="0"/>
-        <w:autoSpaceDN w:val="0"/>
-        <w:adjustRightInd w:val="0"/>
-        <w:spacing w:after="0" w:line="240" w:lineRule="auto"/>
-        <w:rPr>
-          <w:rFonts w:ascii="Calibri" w:hAnsi="Calibri" w:cs="Calibri"/>
-          <w:kern w:val="0"/>
-        </w:rPr>
-      </w:pPr>
-      <w:r>
-        <w:rPr>
-          <w:rFonts w:ascii="Calibri" w:hAnsi="Calibri" w:cs="Calibri"/>
-          <w:kern w:val="0"/>
-        </w:rPr>
-        <w:t>GET .../quotaAllocationRequests/allocationId?api-version=2025-09-01</w:t>
+        <w:t>Required Permissions</w:t>
+      </w:r>
+    </w:p>
+    <w:p>
+      <w:pPr>
+        <w:widowControl w:val="0"/>
+        <w:autoSpaceDE w:val="0"/>
+        <w:autoSpaceDN w:val="0"/>
+        <w:adjustRightInd w:val="0"/>
+        <w:spacing w:after="0" w:line="240" w:lineRule="auto"/>
+        <w:rPr>
+          <w:rFonts w:ascii="Calibri" w:hAnsi="Calibri" w:cs="Calibri"/>
+          <w:kern w:val="0"/>
+        </w:rPr>
+      </w:pPr>
+      <w:r>
+        <w:rPr>
+          <w:rFonts w:ascii="Calibri" w:hAnsi="Calibri" w:cs="Calibri"/>
+          <w:kern w:val="0"/>
+        </w:rPr>
+        <w:t>- Quota API: Microsoft.Quota/groupQuotas/read, subscriptions/read, quotaAllocations/patch</w:t>
+      </w:r>
+    </w:p>
+    <w:p>
+      <w:pPr>
+        <w:widowControl w:val="0"/>
+        <w:autoSpaceDE w:val="0"/>
+        <w:autoSpaceDN w:val="0"/>
+        <w:adjustRightInd w:val="0"/>
+        <w:spacing w:after="0" w:line="240" w:lineRule="auto"/>
+        <w:rPr>
+          <w:rFonts w:ascii="Calibri" w:hAnsi="Calibri" w:cs="Calibri"/>
+          <w:kern w:val="0"/>
+        </w:rPr>
+      </w:pPr>
+      <w:r>
+        <w:rPr>
+          <w:rFonts w:ascii="Calibri" w:hAnsi="Calibri" w:cs="Calibri"/>
+          <w:kern w:val="0"/>
+        </w:rPr>
+        <w:t>- Azure Resource Graph: Microsoft.ResourceGraph/resources/action</w:t>
+      </w:r>
+    </w:p>
+    <w:p>
+      <w:pPr>
+        <w:widowControl w:val="0"/>
+        <w:autoSpaceDE w:val="0"/>
+        <w:autoSpaceDN w:val="0"/>
+        <w:adjustRightInd w:val="0"/>
+        <w:spacing w:after="0" w:line="240" w:lineRule="auto"/>
+        <w:rPr>
+          <w:rFonts w:ascii="Calibri" w:hAnsi="Calibri" w:cs="Calibri"/>
+          <w:kern w:val="0"/>
+        </w:rPr>
+      </w:pPr>
+      <w:r>
+        <w:rPr>
+          <w:rFonts w:ascii="Calibri" w:hAnsi="Calibri" w:cs="Calibri"/>
+          <w:kern w:val="0"/>
+        </w:rPr>
+        <w:t>- Azure Compute: Standard VM SKU and quota list permissions</w:t>
       </w:r>
     </w:p>
     <w:p>
@@ -1212,87 +1098,47 @@
           <w:bCs/>
           <w:kern w:val="0"/>
         </w:rPr>
-        <w:t>Async and Error Handling</w:t>
-      </w:r>
-    </w:p>
-    <w:p>
-      <w:pPr>
-        <w:widowControl w:val="0"/>
-        <w:autoSpaceDE w:val="0"/>
-        <w:autoSpaceDN w:val="0"/>
-        <w:adjustRightInd w:val="0"/>
-        <w:spacing w:after="0" w:line="240" w:lineRule="auto"/>
-        <w:rPr>
-          <w:rFonts w:ascii="Calibri" w:hAnsi="Calibri" w:cs="Calibri"/>
-          <w:kern w:val="0"/>
-        </w:rPr>
-      </w:pPr>
-      <w:r>
-        <w:rPr>
-          <w:rFonts w:ascii="Calibri" w:hAnsi="Calibri" w:cs="Calibri"/>
-          <w:kern w:val="0"/>
-        </w:rPr>
-        <w:t>- Updates can be asynchronous (202 Accepted).</w:t>
-      </w:r>
-    </w:p>
-    <w:p>
-      <w:pPr>
-        <w:widowControl w:val="0"/>
-        <w:autoSpaceDE w:val="0"/>
-        <w:autoSpaceDN w:val="0"/>
-        <w:adjustRightInd w:val="0"/>
-        <w:spacing w:after="0" w:line="240" w:lineRule="auto"/>
-        <w:rPr>
-          <w:rFonts w:ascii="Calibri" w:hAnsi="Calibri" w:cs="Calibri"/>
-          <w:kern w:val="0"/>
-        </w:rPr>
-      </w:pPr>
-      <w:r>
-        <w:rPr>
-          <w:rFonts w:ascii="Calibri" w:hAnsi="Calibri" w:cs="Calibri"/>
-          <w:kern w:val="0"/>
-        </w:rPr>
-        <w:t>- Poll quotaAllocationRequests until terminal state.</w:t>
-      </w:r>
-    </w:p>
-    <w:p>
-      <w:pPr>
-        <w:widowControl w:val="0"/>
-        <w:autoSpaceDE w:val="0"/>
-        <w:autoSpaceDN w:val="0"/>
-        <w:adjustRightInd w:val="0"/>
-        <w:spacing w:after="0" w:line="240" w:lineRule="auto"/>
-        <w:rPr>
-          <w:rFonts w:ascii="Calibri" w:hAnsi="Calibri" w:cs="Calibri"/>
-          <w:kern w:val="0"/>
-        </w:rPr>
-      </w:pPr>
-      <w:r>
-        <w:rPr>
-          <w:rFonts w:ascii="Calibri" w:hAnsi="Calibri" w:cs="Calibri"/>
-          <w:kern w:val="0"/>
-        </w:rPr>
-        <w:t>- Handle RequestThrottled with Retry-After.</w:t>
-      </w:r>
-    </w:p>
-    <w:p>
-      <w:pPr>
-        <w:widowControl w:val="0"/>
-        <w:autoSpaceDE w:val="0"/>
-        <w:autoSpaceDN w:val="0"/>
-        <w:adjustRightInd w:val="0"/>
-        <w:spacing w:after="0" w:line="240" w:lineRule="auto"/>
-        <w:rPr>
-          <w:rFonts w:ascii="Calibri" w:hAnsi="Calibri" w:cs="Calibri"/>
-          <w:kern w:val="0"/>
-        </w:rPr>
-      </w:pPr>
-      <w:r>
-        <w:rPr>
-          <w:rFonts w:ascii="Calibri" w:hAnsi="Calibri" w:cs="Calibri"/>
-          <w:kern w:val="0"/>
-        </w:rPr>
-        <w:t>- Handle EntityAlreadyExists by reusing existing request id and polling.</w:t>
+        <w:t>Hourly Baseline Capture</w:t>
+      </w:r>
+    </w:p>
+    <w:p>
+      <w:pPr>
+        <w:widowControl w:val="0"/>
+        <w:autoSpaceDE w:val="0"/>
+        <w:autoSpaceDN w:val="0"/>
+        <w:adjustRightInd w:val="0"/>
+        <w:spacing w:after="0" w:line="240" w:lineRule="auto"/>
+        <w:rPr>
+          <w:rFonts w:ascii="Calibri" w:hAnsi="Calibri" w:cs="Calibri"/>
+          <w:kern w:val="0"/>
+        </w:rPr>
+      </w:pPr>
+      <w:r>
+        <w:rPr>
+          <w:rFonts w:ascii="Calibri" w:hAnsi="Calibri" w:cs="Calibri"/>
+          <w:kern w:val="0"/>
+        </w:rPr>
+        <w:t>Run:</w:t>
+      </w:r>
+    </w:p>
+    <w:p>
+      <w:pPr>
+        <w:widowControl w:val="0"/>
+        <w:autoSpaceDE w:val="0"/>
+        <w:autoSpaceDN w:val="0"/>
+        <w:adjustRightInd w:val="0"/>
+        <w:spacing w:after="0" w:line="240" w:lineRule="auto"/>
+        <w:rPr>
+          <w:rFonts w:ascii="Calibri" w:hAnsi="Calibri" w:cs="Calibri"/>
+          <w:kern w:val="0"/>
+        </w:rPr>
+      </w:pPr>
+      <w:r>
+        <w:rPr>
+          <w:rFonts w:ascii="Calibri" w:hAnsi="Calibri" w:cs="Calibri"/>
+          <w:kern w:val="0"/>
+        </w:rPr>
+        <w:t>.AzVMAvailability.ps1 -NoPrompt -AllSubscriptions -RegionPreset USMajor -CaptureQuotaHistory -QuotaGroupCandidates</w:t>
       </w:r>
     </w:p>
     <w:p>
@@ -1327,87 +1173,100 @@
           <w:bCs/>
           <w:kern w:val="0"/>
         </w:rPr>
-        <w:t>Scale Guidance for 1000+ Subscriptions</w:t>
-      </w:r>
-    </w:p>
-    <w:p>
-      <w:pPr>
-        <w:widowControl w:val="0"/>
-        <w:autoSpaceDE w:val="0"/>
-        <w:autoSpaceDN w:val="0"/>
-        <w:adjustRightInd w:val="0"/>
-        <w:spacing w:after="0" w:line="240" w:lineRule="auto"/>
-        <w:rPr>
-          <w:rFonts w:ascii="Calibri" w:hAnsi="Calibri" w:cs="Calibri"/>
-          <w:kern w:val="0"/>
-        </w:rPr>
-      </w:pPr>
-      <w:r>
-        <w:rPr>
-          <w:rFonts w:ascii="Calibri" w:hAnsi="Calibri" w:cs="Calibri"/>
-          <w:kern w:val="0"/>
-        </w:rPr>
-        <w:t>- Measure one real run and compute seconds per subscription.</w:t>
-      </w:r>
-    </w:p>
-    <w:p>
-      <w:pPr>
-        <w:widowControl w:val="0"/>
-        <w:autoSpaceDE w:val="0"/>
-        <w:autoSpaceDN w:val="0"/>
-        <w:adjustRightInd w:val="0"/>
-        <w:spacing w:after="0" w:line="240" w:lineRule="auto"/>
-        <w:rPr>
-          <w:rFonts w:ascii="Calibri" w:hAnsi="Calibri" w:cs="Calibri"/>
-          <w:kern w:val="0"/>
-        </w:rPr>
-      </w:pPr>
-      <w:r>
-        <w:rPr>
-          <w:rFonts w:ascii="Calibri" w:hAnsi="Calibri" w:cs="Calibri"/>
-          <w:kern w:val="0"/>
-        </w:rPr>
-        <w:t>- Project total runtime for N subscriptions.</w:t>
-      </w:r>
-    </w:p>
-    <w:p>
-      <w:pPr>
-        <w:widowControl w:val="0"/>
-        <w:autoSpaceDE w:val="0"/>
-        <w:autoSpaceDN w:val="0"/>
-        <w:adjustRightInd w:val="0"/>
-        <w:spacing w:after="0" w:line="240" w:lineRule="auto"/>
-        <w:rPr>
-          <w:rFonts w:ascii="Calibri" w:hAnsi="Calibri" w:cs="Calibri"/>
-          <w:kern w:val="0"/>
-        </w:rPr>
-      </w:pPr>
-      <w:r>
-        <w:rPr>
-          <w:rFonts w:ascii="Calibri" w:hAnsi="Calibri" w:cs="Calibri"/>
-          <w:kern w:val="0"/>
-        </w:rPr>
-        <w:t>- Batch subscriptions (for example 100-250 per run).</w:t>
-      </w:r>
-    </w:p>
-    <w:p>
-      <w:pPr>
-        <w:widowControl w:val="0"/>
-        <w:autoSpaceDE w:val="0"/>
-        <w:autoSpaceDN w:val="0"/>
-        <w:adjustRightInd w:val="0"/>
-        <w:spacing w:after="0" w:line="240" w:lineRule="auto"/>
-        <w:rPr>
-          <w:rFonts w:ascii="Calibri" w:hAnsi="Calibri" w:cs="Calibri"/>
-          <w:kern w:val="0"/>
-        </w:rPr>
-      </w:pPr>
-      <w:r>
-        <w:rPr>
-          <w:rFonts w:ascii="Calibri" w:hAnsi="Calibri" w:cs="Calibri"/>
-          <w:kern w:val="0"/>
-        </w:rPr>
-        <w:t>- Stagger schedules to reduce throttling.</w:t>
+        <w:t>Discover and Plan</w:t>
+      </w:r>
+    </w:p>
+    <w:p>
+      <w:pPr>
+        <w:widowControl w:val="0"/>
+        <w:autoSpaceDE w:val="0"/>
+        <w:autoSpaceDN w:val="0"/>
+        <w:adjustRightInd w:val="0"/>
+        <w:spacing w:after="0" w:line="240" w:lineRule="auto"/>
+        <w:rPr>
+          <w:rFonts w:ascii="Calibri" w:hAnsi="Calibri" w:cs="Calibri"/>
+          <w:kern w:val="0"/>
+        </w:rPr>
+      </w:pPr>
+      <w:r>
+        <w:rPr>
+          <w:rFonts w:ascii="Calibri" w:hAnsi="Calibri" w:cs="Calibri"/>
+          <w:kern w:val="0"/>
+        </w:rPr>
+        <w:t>Run discovery:</w:t>
+      </w:r>
+    </w:p>
+    <w:p>
+      <w:pPr>
+        <w:widowControl w:val="0"/>
+        <w:autoSpaceDE w:val="0"/>
+        <w:autoSpaceDN w:val="0"/>
+        <w:adjustRightInd w:val="0"/>
+        <w:spacing w:after="0" w:line="240" w:lineRule="auto"/>
+        <w:rPr>
+          <w:rFonts w:ascii="Calibri" w:hAnsi="Calibri" w:cs="Calibri"/>
+          <w:kern w:val="0"/>
+        </w:rPr>
+      </w:pPr>
+      <w:r>
+        <w:rPr>
+          <w:rFonts w:ascii="Calibri" w:hAnsi="Calibri" w:cs="Calibri"/>
+          <w:kern w:val="0"/>
+        </w:rPr>
+        <w:t>.AzVMAvailability.ps1 -NoPrompt -AllSubscriptions -RegionPreset USMajor -CaptureQuotaHistory -QuotaGroupCandidates -QuotaGroupDiscover</w:t>
+      </w:r>
+    </w:p>
+    <w:p>
+      <w:pPr>
+        <w:widowControl w:val="0"/>
+        <w:autoSpaceDE w:val="0"/>
+        <w:autoSpaceDN w:val="0"/>
+        <w:adjustRightInd w:val="0"/>
+        <w:spacing w:after="0" w:line="240" w:lineRule="auto"/>
+        <w:rPr>
+          <w:rFonts w:ascii="Calibri" w:hAnsi="Calibri" w:cs="Calibri"/>
+          <w:kern w:val="0"/>
+        </w:rPr>
+      </w:pPr>
+    </w:p>
+    <w:p>
+      <w:pPr>
+        <w:widowControl w:val="0"/>
+        <w:autoSpaceDE w:val="0"/>
+        <w:autoSpaceDN w:val="0"/>
+        <w:adjustRightInd w:val="0"/>
+        <w:spacing w:after="0" w:line="240" w:lineRule="auto"/>
+        <w:rPr>
+          <w:rFonts w:ascii="Calibri" w:hAnsi="Calibri" w:cs="Calibri"/>
+          <w:kern w:val="0"/>
+        </w:rPr>
+      </w:pPr>
+      <w:r>
+        <w:rPr>
+          <w:rFonts w:ascii="Calibri" w:hAnsi="Calibri" w:cs="Calibri"/>
+          <w:kern w:val="0"/>
+        </w:rPr>
+        <w:t>Generate plan:</w:t>
+      </w:r>
+    </w:p>
+    <w:p>
+      <w:pPr>
+        <w:widowControl w:val="0"/>
+        <w:autoSpaceDE w:val="0"/>
+        <w:autoSpaceDN w:val="0"/>
+        <w:adjustRightInd w:val="0"/>
+        <w:spacing w:after="0" w:line="240" w:lineRule="auto"/>
+        <w:rPr>
+          <w:rFonts w:ascii="Calibri" w:hAnsi="Calibri" w:cs="Calibri"/>
+          <w:kern w:val="0"/>
+        </w:rPr>
+      </w:pPr>
+      <w:r>
+        <w:rPr>
+          <w:rFonts w:ascii="Calibri" w:hAnsi="Calibri" w:cs="Calibri"/>
+          <w:kern w:val="0"/>
+        </w:rPr>
+        <w:t>.AzVMAvailability.ps1 -NoPrompt -AllSubscriptions -RegionPreset USMajor -QuotaGroupCandidates -QuotaGroupPlan -QuotaGroupManagementGroupId &lt;management-group-id&gt; -QuotaGroupName &lt;quota-group-name&gt;</w:t>
       </w:r>
     </w:p>
     <w:p>
@@ -1442,27 +1301,160 @@
           <w:bCs/>
           <w:kern w:val="0"/>
         </w:rPr>
-        <w:t>Suggested Batch Model</w:t>
-      </w:r>
-    </w:p>
-    <w:p>
-      <w:pPr>
-        <w:widowControl w:val="0"/>
-        <w:autoSpaceDE w:val="0"/>
-        <w:autoSpaceDN w:val="0"/>
-        <w:adjustRightInd w:val="0"/>
-        <w:spacing w:after="0" w:line="240" w:lineRule="auto"/>
-        <w:rPr>
-          <w:rFonts w:ascii="Calibri" w:hAnsi="Calibri" w:cs="Calibri"/>
-          <w:kern w:val="0"/>
-        </w:rPr>
-      </w:pPr>
-      <w:r>
-        <w:rPr>
-          <w:rFonts w:ascii="Calibri" w:hAnsi="Calibri" w:cs="Calibri"/>
-          <w:kern w:val="0"/>
-        </w:rPr>
-        <w:t>1000 subscriptions -&gt; 10 tasks x 100 subscriptions, staggered hourly starts.</w:t>
+        <w:t>Apply and Verify</w:t>
+      </w:r>
+    </w:p>
+    <w:p>
+      <w:pPr>
+        <w:widowControl w:val="0"/>
+        <w:autoSpaceDE w:val="0"/>
+        <w:autoSpaceDN w:val="0"/>
+        <w:adjustRightInd w:val="0"/>
+        <w:spacing w:after="0" w:line="240" w:lineRule="auto"/>
+        <w:rPr>
+          <w:rFonts w:ascii="Calibri" w:hAnsi="Calibri" w:cs="Calibri"/>
+          <w:kern w:val="0"/>
+        </w:rPr>
+      </w:pPr>
+      <w:r>
+        <w:rPr>
+          <w:rFonts w:ascii="Calibri" w:hAnsi="Calibri" w:cs="Calibri"/>
+          <w:kern w:val="0"/>
+        </w:rPr>
+        <w:t>Apply from script plan:</w:t>
+      </w:r>
+    </w:p>
+    <w:p>
+      <w:pPr>
+        <w:widowControl w:val="0"/>
+        <w:autoSpaceDE w:val="0"/>
+        <w:autoSpaceDN w:val="0"/>
+        <w:adjustRightInd w:val="0"/>
+        <w:spacing w:after="0" w:line="240" w:lineRule="auto"/>
+        <w:rPr>
+          <w:rFonts w:ascii="Calibri" w:hAnsi="Calibri" w:cs="Calibri"/>
+          <w:kern w:val="0"/>
+        </w:rPr>
+      </w:pPr>
+      <w:r>
+        <w:rPr>
+          <w:rFonts w:ascii="Calibri" w:hAnsi="Calibri" w:cs="Calibri"/>
+          <w:kern w:val="0"/>
+        </w:rPr>
+        <w:t>.AzVMAvailability.ps1 -NoPrompt -AllSubscriptions -RegionPreset USMajor -QuotaGroupCandidates -QuotaGroupPlan -QuotaGroupApply -QuotaGroupForceConfirm -QuotaGroupManagementGroupId &lt;management-group-id&gt; -QuotaGroupName &lt;quota-group-name&gt;</w:t>
+      </w:r>
+    </w:p>
+    <w:p>
+      <w:pPr>
+        <w:widowControl w:val="0"/>
+        <w:autoSpaceDE w:val="0"/>
+        <w:autoSpaceDN w:val="0"/>
+        <w:adjustRightInd w:val="0"/>
+        <w:spacing w:after="0" w:line="240" w:lineRule="auto"/>
+        <w:rPr>
+          <w:rFonts w:ascii="Calibri" w:hAnsi="Calibri" w:cs="Calibri"/>
+          <w:kern w:val="0"/>
+        </w:rPr>
+      </w:pPr>
+    </w:p>
+    <w:p>
+      <w:pPr>
+        <w:widowControl w:val="0"/>
+        <w:autoSpaceDE w:val="0"/>
+        <w:autoSpaceDN w:val="0"/>
+        <w:adjustRightInd w:val="0"/>
+        <w:spacing w:after="0" w:line="240" w:lineRule="auto"/>
+        <w:rPr>
+          <w:rFonts w:ascii="Calibri" w:hAnsi="Calibri" w:cs="Calibri"/>
+          <w:kern w:val="0"/>
+        </w:rPr>
+      </w:pPr>
+      <w:r>
+        <w:rPr>
+          <w:rFonts w:ascii="Calibri" w:hAnsi="Calibri" w:cs="Calibri"/>
+          <w:kern w:val="0"/>
+        </w:rPr>
+        <w:t>Direct API paths:</w:t>
+      </w:r>
+    </w:p>
+    <w:p>
+      <w:pPr>
+        <w:widowControl w:val="0"/>
+        <w:autoSpaceDE w:val="0"/>
+        <w:autoSpaceDN w:val="0"/>
+        <w:adjustRightInd w:val="0"/>
+        <w:spacing w:after="0" w:line="240" w:lineRule="auto"/>
+        <w:rPr>
+          <w:rFonts w:ascii="Calibri" w:hAnsi="Calibri" w:cs="Calibri"/>
+          <w:kern w:val="0"/>
+        </w:rPr>
+      </w:pPr>
+      <w:r>
+        <w:rPr>
+          <w:rFonts w:ascii="Calibri" w:hAnsi="Calibri" w:cs="Calibri"/>
+          <w:kern w:val="0"/>
+        </w:rPr>
+        <w:t>GET .../quotaAllocations/location?api-version=2025-09-01</w:t>
+      </w:r>
+    </w:p>
+    <w:p>
+      <w:pPr>
+        <w:widowControl w:val="0"/>
+        <w:autoSpaceDE w:val="0"/>
+        <w:autoSpaceDN w:val="0"/>
+        <w:adjustRightInd w:val="0"/>
+        <w:spacing w:after="0" w:line="240" w:lineRule="auto"/>
+        <w:rPr>
+          <w:rFonts w:ascii="Calibri" w:hAnsi="Calibri" w:cs="Calibri"/>
+          <w:kern w:val="0"/>
+        </w:rPr>
+      </w:pPr>
+      <w:r>
+        <w:rPr>
+          <w:rFonts w:ascii="Calibri" w:hAnsi="Calibri" w:cs="Calibri"/>
+          <w:kern w:val="0"/>
+        </w:rPr>
+        <w:t>PATCH .../quotaAllocations/location?api-version=2025-09-01</w:t>
+      </w:r>
+    </w:p>
+    <w:p>
+      <w:pPr>
+        <w:widowControl w:val="0"/>
+        <w:autoSpaceDE w:val="0"/>
+        <w:autoSpaceDN w:val="0"/>
+        <w:adjustRightInd w:val="0"/>
+        <w:spacing w:after="0" w:line="240" w:lineRule="auto"/>
+        <w:rPr>
+          <w:rFonts w:ascii="Calibri" w:hAnsi="Calibri" w:cs="Calibri"/>
+          <w:kern w:val="0"/>
+        </w:rPr>
+      </w:pPr>
+      <w:r>
+        <w:rPr>
+          <w:rFonts w:ascii="Calibri" w:hAnsi="Calibri" w:cs="Calibri"/>
+          <w:kern w:val="0"/>
+        </w:rPr>
+        <w:t>GET .../quotaAllocationRequests?...&amp;$filter=location eq location</w:t>
+      </w:r>
+    </w:p>
+    <w:p>
+      <w:pPr>
+        <w:widowControl w:val="0"/>
+        <w:autoSpaceDE w:val="0"/>
+        <w:autoSpaceDN w:val="0"/>
+        <w:adjustRightInd w:val="0"/>
+        <w:spacing w:after="0" w:line="240" w:lineRule="auto"/>
+        <w:rPr>
+          <w:rFonts w:ascii="Calibri" w:hAnsi="Calibri" w:cs="Calibri"/>
+          <w:kern w:val="0"/>
+        </w:rPr>
+      </w:pPr>
+      <w:r>
+        <w:rPr>
+          <w:rFonts w:ascii="Calibri" w:hAnsi="Calibri" w:cs="Calibri"/>
+          <w:kern w:val="0"/>
+        </w:rPr>
+        <w:t>GET .../quotaAllocationRequests/allocationId?api-version=2025-09-01</w:t>
       </w:r>
     </w:p>
     <w:p>
@@ -1497,7 +1489,87 @@
           <w:bCs/>
           <w:kern w:val="0"/>
         </w:rPr>
-        <w:t>Full Example Commands</w:t>
+        <w:t>Async and Error Handling</w:t>
+      </w:r>
+    </w:p>
+    <w:p>
+      <w:pPr>
+        <w:widowControl w:val="0"/>
+        <w:autoSpaceDE w:val="0"/>
+        <w:autoSpaceDN w:val="0"/>
+        <w:adjustRightInd w:val="0"/>
+        <w:spacing w:after="0" w:line="240" w:lineRule="auto"/>
+        <w:rPr>
+          <w:rFonts w:ascii="Calibri" w:hAnsi="Calibri" w:cs="Calibri"/>
+          <w:kern w:val="0"/>
+        </w:rPr>
+      </w:pPr>
+      <w:r>
+        <w:rPr>
+          <w:rFonts w:ascii="Calibri" w:hAnsi="Calibri" w:cs="Calibri"/>
+          <w:kern w:val="0"/>
+        </w:rPr>
+        <w:t>- Updates can be asynchronous (202 Accepted).</w:t>
+      </w:r>
+    </w:p>
+    <w:p>
+      <w:pPr>
+        <w:widowControl w:val="0"/>
+        <w:autoSpaceDE w:val="0"/>
+        <w:autoSpaceDN w:val="0"/>
+        <w:adjustRightInd w:val="0"/>
+        <w:spacing w:after="0" w:line="240" w:lineRule="auto"/>
+        <w:rPr>
+          <w:rFonts w:ascii="Calibri" w:hAnsi="Calibri" w:cs="Calibri"/>
+          <w:kern w:val="0"/>
+        </w:rPr>
+      </w:pPr>
+      <w:r>
+        <w:rPr>
+          <w:rFonts w:ascii="Calibri" w:hAnsi="Calibri" w:cs="Calibri"/>
+          <w:kern w:val="0"/>
+        </w:rPr>
+        <w:t>- Poll quotaAllocationRequests until terminal state.</w:t>
+      </w:r>
+    </w:p>
+    <w:p>
+      <w:pPr>
+        <w:widowControl w:val="0"/>
+        <w:autoSpaceDE w:val="0"/>
+        <w:autoSpaceDN w:val="0"/>
+        <w:adjustRightInd w:val="0"/>
+        <w:spacing w:after="0" w:line="240" w:lineRule="auto"/>
+        <w:rPr>
+          <w:rFonts w:ascii="Calibri" w:hAnsi="Calibri" w:cs="Calibri"/>
+          <w:kern w:val="0"/>
+        </w:rPr>
+      </w:pPr>
+      <w:r>
+        <w:rPr>
+          <w:rFonts w:ascii="Calibri" w:hAnsi="Calibri" w:cs="Calibri"/>
+          <w:kern w:val="0"/>
+        </w:rPr>
+        <w:t>- Handle RequestThrottled with Retry-After.</w:t>
+      </w:r>
+    </w:p>
+    <w:p>
+      <w:pPr>
+        <w:widowControl w:val="0"/>
+        <w:autoSpaceDE w:val="0"/>
+        <w:autoSpaceDN w:val="0"/>
+        <w:adjustRightInd w:val="0"/>
+        <w:spacing w:after="0" w:line="240" w:lineRule="auto"/>
+        <w:rPr>
+          <w:rFonts w:ascii="Calibri" w:hAnsi="Calibri" w:cs="Calibri"/>
+          <w:kern w:val="0"/>
+        </w:rPr>
+      </w:pPr>
+      <w:r>
+        <w:rPr>
+          <w:rFonts w:ascii="Calibri" w:hAnsi="Calibri" w:cs="Calibri"/>
+          <w:kern w:val="0"/>
+        </w:rPr>
+        <w:t>- Handle EntityAlreadyExists by reusing existing request id and polling.</w:t>
       </w:r>
     </w:p>
     <w:p>
@@ -1532,27 +1604,87 @@
           <w:bCs/>
           <w:kern w:val="0"/>
         </w:rPr>
-        <w:t>1) Hourly baseline capture (history + candidates)</w:t>
-      </w:r>
-    </w:p>
-    <w:p>
-      <w:pPr>
-        <w:widowControl w:val="0"/>
-        <w:autoSpaceDE w:val="0"/>
-        <w:autoSpaceDN w:val="0"/>
-        <w:adjustRightInd w:val="0"/>
-        <w:spacing w:after="0" w:line="240" w:lineRule="auto"/>
-        <w:rPr>
-          <w:rFonts w:ascii="Calibri" w:hAnsi="Calibri" w:cs="Calibri"/>
-          <w:kern w:val="0"/>
-        </w:rPr>
-      </w:pPr>
-      <w:r>
-        <w:rPr>
-          <w:rFonts w:ascii="Calibri" w:hAnsi="Calibri" w:cs="Calibri"/>
-          <w:kern w:val="0"/>
-        </w:rPr>
-        <w:t>.AzVMAvailability.ps1 -NoPrompt -AllSubscriptions -RegionPreset USMajor -CaptureQuotaHistory -QuotaGroupCandidates -QuotaGroupMinMovable 20 -QuotaGroupSafetyBuffer 10 -QuotaHistoryPath "C:" -QuotaGroupReportPath "C:" -ExportPath "C:" -OutputFormat CSV -JsonOutput -MaxRetries 4 -Verbose</w:t>
+        <w:t>Scale Guidance for 1000+ Subscriptions</w:t>
+      </w:r>
+    </w:p>
+    <w:p>
+      <w:pPr>
+        <w:widowControl w:val="0"/>
+        <w:autoSpaceDE w:val="0"/>
+        <w:autoSpaceDN w:val="0"/>
+        <w:adjustRightInd w:val="0"/>
+        <w:spacing w:after="0" w:line="240" w:lineRule="auto"/>
+        <w:rPr>
+          <w:rFonts w:ascii="Calibri" w:hAnsi="Calibri" w:cs="Calibri"/>
+          <w:kern w:val="0"/>
+        </w:rPr>
+      </w:pPr>
+      <w:r>
+        <w:rPr>
+          <w:rFonts w:ascii="Calibri" w:hAnsi="Calibri" w:cs="Calibri"/>
+          <w:kern w:val="0"/>
+        </w:rPr>
+        <w:t>- Measure one real run and compute seconds per subscription.</w:t>
+      </w:r>
+    </w:p>
+    <w:p>
+      <w:pPr>
+        <w:widowControl w:val="0"/>
+        <w:autoSpaceDE w:val="0"/>
+        <w:autoSpaceDN w:val="0"/>
+        <w:adjustRightInd w:val="0"/>
+        <w:spacing w:after="0" w:line="240" w:lineRule="auto"/>
+        <w:rPr>
+          <w:rFonts w:ascii="Calibri" w:hAnsi="Calibri" w:cs="Calibri"/>
+          <w:kern w:val="0"/>
+        </w:rPr>
+      </w:pPr>
+      <w:r>
+        <w:rPr>
+          <w:rFonts w:ascii="Calibri" w:hAnsi="Calibri" w:cs="Calibri"/>
+          <w:kern w:val="0"/>
+        </w:rPr>
+        <w:t>- Project total runtime for N subscriptions.</w:t>
+      </w:r>
+    </w:p>
+    <w:p>
+      <w:pPr>
+        <w:widowControl w:val="0"/>
+        <w:autoSpaceDE w:val="0"/>
+        <w:autoSpaceDN w:val="0"/>
+        <w:adjustRightInd w:val="0"/>
+        <w:spacing w:after="0" w:line="240" w:lineRule="auto"/>
+        <w:rPr>
+          <w:rFonts w:ascii="Calibri" w:hAnsi="Calibri" w:cs="Calibri"/>
+          <w:kern w:val="0"/>
+        </w:rPr>
+      </w:pPr>
+      <w:r>
+        <w:rPr>
+          <w:rFonts w:ascii="Calibri" w:hAnsi="Calibri" w:cs="Calibri"/>
+          <w:kern w:val="0"/>
+        </w:rPr>
+        <w:t>- Batch subscriptions (for example 100-250 per run).</w:t>
+      </w:r>
+    </w:p>
+    <w:p>
+      <w:pPr>
+        <w:widowControl w:val="0"/>
+        <w:autoSpaceDE w:val="0"/>
+        <w:autoSpaceDN w:val="0"/>
+        <w:adjustRightInd w:val="0"/>
+        <w:spacing w:after="0" w:line="240" w:lineRule="auto"/>
+        <w:rPr>
+          <w:rFonts w:ascii="Calibri" w:hAnsi="Calibri" w:cs="Calibri"/>
+          <w:kern w:val="0"/>
+        </w:rPr>
+      </w:pPr>
+      <w:r>
+        <w:rPr>
+          <w:rFonts w:ascii="Calibri" w:hAnsi="Calibri" w:cs="Calibri"/>
+          <w:kern w:val="0"/>
+        </w:rPr>
+        <w:t>- Stagger schedules to reduce throttling.</w:t>
       </w:r>
     </w:p>
     <w:p>
@@ -1587,27 +1719,27 @@
           <w:bCs/>
           <w:kern w:val="0"/>
         </w:rPr>
-        <w:t>2) Discover groups and generate candidate data</w:t>
-      </w:r>
-    </w:p>
-    <w:p>
-      <w:pPr>
-        <w:widowControl w:val="0"/>
-        <w:autoSpaceDE w:val="0"/>
-        <w:autoSpaceDN w:val="0"/>
-        <w:adjustRightInd w:val="0"/>
-        <w:spacing w:after="0" w:line="240" w:lineRule="auto"/>
-        <w:rPr>
-          <w:rFonts w:ascii="Calibri" w:hAnsi="Calibri" w:cs="Calibri"/>
-          <w:kern w:val="0"/>
-        </w:rPr>
-      </w:pPr>
-      <w:r>
-        <w:rPr>
-          <w:rFonts w:ascii="Calibri" w:hAnsi="Calibri" w:cs="Calibri"/>
-          <w:kern w:val="0"/>
-        </w:rPr>
-        <w:t>.AzVMAvailability.ps1 -NoPrompt -AllSubscriptions -RegionPreset USMajor -CaptureQuotaHistory -QuotaGroupCandidates -QuotaGroupDiscover -QuotaGroupMinMovable 15 -QuotaGroupSafetyBuffer 12 -QuotaHistoryPath "C:" -QuotaGroupReportPath "C:" -ExportPath "C:" -JsonOutput -MaxRetries 4 -Verbose</w:t>
+        <w:t>Suggested Batch Model</w:t>
+      </w:r>
+    </w:p>
+    <w:p>
+      <w:pPr>
+        <w:widowControl w:val="0"/>
+        <w:autoSpaceDE w:val="0"/>
+        <w:autoSpaceDN w:val="0"/>
+        <w:adjustRightInd w:val="0"/>
+        <w:spacing w:after="0" w:line="240" w:lineRule="auto"/>
+        <w:rPr>
+          <w:rFonts w:ascii="Calibri" w:hAnsi="Calibri" w:cs="Calibri"/>
+          <w:kern w:val="0"/>
+        </w:rPr>
+      </w:pPr>
+      <w:r>
+        <w:rPr>
+          <w:rFonts w:ascii="Calibri" w:hAnsi="Calibri" w:cs="Calibri"/>
+          <w:kern w:val="0"/>
+        </w:rPr>
+        <w:t>1000 subscriptions -&gt; 10 tasks x 100 subscriptions, staggered hourly starts.</w:t>
       </w:r>
     </w:p>
     <w:p>
@@ -1642,6 +1774,151 @@
           <w:bCs/>
           <w:kern w:val="0"/>
         </w:rPr>
+        <w:t>Full Example Commands</w:t>
+      </w:r>
+    </w:p>
+    <w:p>
+      <w:pPr>
+        <w:widowControl w:val="0"/>
+        <w:autoSpaceDE w:val="0"/>
+        <w:autoSpaceDN w:val="0"/>
+        <w:adjustRightInd w:val="0"/>
+        <w:spacing w:after="0" w:line="240" w:lineRule="auto"/>
+        <w:rPr>
+          <w:rFonts w:ascii="Calibri" w:hAnsi="Calibri" w:cs="Calibri"/>
+          <w:kern w:val="0"/>
+        </w:rPr>
+      </w:pPr>
+    </w:p>
+    <w:p>
+      <w:pPr>
+        <w:widowControl w:val="0"/>
+        <w:autoSpaceDE w:val="0"/>
+        <w:autoSpaceDN w:val="0"/>
+        <w:adjustRightInd w:val="0"/>
+        <w:spacing w:after="0" w:line="240" w:lineRule="auto"/>
+        <w:rPr>
+          <w:rFonts w:ascii="Calibri" w:hAnsi="Calibri" w:cs="Calibri"/>
+          <w:kern w:val="0"/>
+        </w:rPr>
+      </w:pPr>
+      <w:r>
+        <w:rPr>
+          <w:rFonts w:ascii="Calibri" w:hAnsi="Calibri" w:cs="Calibri"/>
+          <w:b/>
+          <w:bCs/>
+          <w:kern w:val="0"/>
+        </w:rPr>
+        <w:t>1) Hourly baseline capture (history + candidates)</w:t>
+      </w:r>
+    </w:p>
+    <w:p>
+      <w:pPr>
+        <w:widowControl w:val="0"/>
+        <w:autoSpaceDE w:val="0"/>
+        <w:autoSpaceDN w:val="0"/>
+        <w:adjustRightInd w:val="0"/>
+        <w:spacing w:after="0" w:line="240" w:lineRule="auto"/>
+        <w:rPr>
+          <w:rFonts w:ascii="Calibri" w:hAnsi="Calibri" w:cs="Calibri"/>
+          <w:kern w:val="0"/>
+        </w:rPr>
+      </w:pPr>
+      <w:r>
+        <w:rPr>
+          <w:rFonts w:ascii="Calibri" w:hAnsi="Calibri" w:cs="Calibri"/>
+          <w:kern w:val="0"/>
+        </w:rPr>
+        <w:t>.AzVMAvailability.ps1 -NoPrompt -AllSubscriptions -RegionPreset USMajor -CaptureQuotaHistory -QuotaGroupCandidates -QuotaGroupMinMovable 20 -QuotaGroupSafetyBuffer 10 -QuotaHistoryPath "C:" -QuotaGroupReportPath "C:" -ExportPath "C:" -OutputFormat CSV -JsonOutput -MaxRetries 4 -Verbose</w:t>
+      </w:r>
+    </w:p>
+    <w:p>
+      <w:pPr>
+        <w:widowControl w:val="0"/>
+        <w:autoSpaceDE w:val="0"/>
+        <w:autoSpaceDN w:val="0"/>
+        <w:adjustRightInd w:val="0"/>
+        <w:spacing w:after="0" w:line="240" w:lineRule="auto"/>
+        <w:rPr>
+          <w:rFonts w:ascii="Calibri" w:hAnsi="Calibri" w:cs="Calibri"/>
+          <w:kern w:val="0"/>
+        </w:rPr>
+      </w:pPr>
+    </w:p>
+    <w:p>
+      <w:pPr>
+        <w:widowControl w:val="0"/>
+        <w:autoSpaceDE w:val="0"/>
+        <w:autoSpaceDN w:val="0"/>
+        <w:adjustRightInd w:val="0"/>
+        <w:spacing w:after="0" w:line="240" w:lineRule="auto"/>
+        <w:rPr>
+          <w:rFonts w:ascii="Calibri" w:hAnsi="Calibri" w:cs="Calibri"/>
+          <w:kern w:val="0"/>
+        </w:rPr>
+      </w:pPr>
+      <w:r>
+        <w:rPr>
+          <w:rFonts w:ascii="Calibri" w:hAnsi="Calibri" w:cs="Calibri"/>
+          <w:b/>
+          <w:bCs/>
+          <w:kern w:val="0"/>
+        </w:rPr>
+        <w:t>2) Discover groups and generate candidate data</w:t>
+      </w:r>
+    </w:p>
+    <w:p>
+      <w:pPr>
+        <w:widowControl w:val="0"/>
+        <w:autoSpaceDE w:val="0"/>
+        <w:autoSpaceDN w:val="0"/>
+        <w:adjustRightInd w:val="0"/>
+        <w:spacing w:after="0" w:line="240" w:lineRule="auto"/>
+        <w:rPr>
+          <w:rFonts w:ascii="Calibri" w:hAnsi="Calibri" w:cs="Calibri"/>
+          <w:kern w:val="0"/>
+        </w:rPr>
+      </w:pPr>
+      <w:r>
+        <w:rPr>
+          <w:rFonts w:ascii="Calibri" w:hAnsi="Calibri" w:cs="Calibri"/>
+          <w:kern w:val="0"/>
+        </w:rPr>
+        <w:t>.AzVMAvailability.ps1 -NoPrompt -AllSubscriptions -RegionPreset USMajor -CaptureQuotaHistory -QuotaGroupCandidates -QuotaGroupDiscover -QuotaGroupMinMovable 15 -QuotaGroupSafetyBuffer 12 -QuotaHistoryPath "C:" -QuotaGroupReportPath "C:" -ExportPath "C:" -JsonOutput -MaxRetries 4 -Verbose</w:t>
+      </w:r>
+    </w:p>
+    <w:p>
+      <w:pPr>
+        <w:widowControl w:val="0"/>
+        <w:autoSpaceDE w:val="0"/>
+        <w:autoSpaceDN w:val="0"/>
+        <w:adjustRightInd w:val="0"/>
+        <w:spacing w:after="0" w:line="240" w:lineRule="auto"/>
+        <w:rPr>
+          <w:rFonts w:ascii="Calibri" w:hAnsi="Calibri" w:cs="Calibri"/>
+          <w:kern w:val="0"/>
+        </w:rPr>
+      </w:pPr>
+    </w:p>
+    <w:p>
+      <w:pPr>
+        <w:widowControl w:val="0"/>
+        <w:autoSpaceDE w:val="0"/>
+        <w:autoSpaceDN w:val="0"/>
+        <w:adjustRightInd w:val="0"/>
+        <w:spacing w:after="0" w:line="240" w:lineRule="auto"/>
+        <w:rPr>
+          <w:rFonts w:ascii="Calibri" w:hAnsi="Calibri" w:cs="Calibri"/>
+          <w:kern w:val="0"/>
+        </w:rPr>
+      </w:pPr>
+      <w:r>
+        <w:rPr>
+          <w:rFonts w:ascii="Calibri" w:hAnsi="Calibri" w:cs="Calibri"/>
+          <w:b/>
+          <w:bCs/>
+          <w:kern w:val="0"/>
+        </w:rPr>
         <w:t>3) Build quota move plan for selected group</w:t>
       </w:r>
     </w:p>
@@ -1662,14 +1939,7 @@
           <w:rFonts w:ascii="Calibri" w:hAnsi="Calibri" w:cs="Calibri"/>
           <w:kern w:val="0"/>
         </w:rPr>
-        <w:t>.</w:t>
-      </w:r>
-      <w:r>
-        <w:rPr>
-          <w:rFonts w:ascii="Calibri" w:hAnsi="Calibri" w:cs="Calibri"/>
-          <w:kern w:val="0"/>
-        </w:rPr>
-        <w:t>AzVMAvailability.ps1 -NoPrompt -AllSubscriptions -RegionPreset USMajor -QuotaGroupCandidates -QuotaGroupPlan -QuotaGroupManagementGroupId "&lt;management-group-id&gt;" -QuotaGroupName "&lt;quota-group-name&gt;" -QuotaGroupMinMovable 10 -QuotaGroupSafetyBuffer 10 -QuotaHistoryPath "C:" -QuotaGroupReportPath "C:" -ExportPath "C:" -OutputFormat CSV -JsonOutput -MaxRetries 4 -Verbose</w:t>
+        <w:t>.AzVMAvailability.ps1 -NoPrompt -AllSubscriptions -RegionPreset USMajor -QuotaGroupCandidates -QuotaGroupPlan -QuotaGroupManagementGroupId "&lt;management-group-id&gt;" -QuotaGroupName "&lt;quota-group-name&gt;" -QuotaGroupMinMovable 10 -QuotaGroupSafetyBuffer 10 -QuotaHistoryPath "C:" -QuotaGroupReportPath "C:" -ExportPath "C:" -OutputFormat CSV -JsonOutput -MaxRetries 4 -Verbose</w:t>
       </w:r>
     </w:p>
     <w:p>
@@ -3241,12 +3511,11 @@
   <w:docDefaults>
     <w:rPrDefault>
       <w:rPr>
-        <w:rFonts w:asciiTheme="minorHAnsi" w:eastAsiaTheme="minorEastAsia" w:hAnsiTheme="minorHAnsi" w:cstheme="minorBidi"/>
+        <w:rFonts w:asciiTheme="minorHAnsi" w:eastAsiaTheme="minorEastAsia" w:hAnsiTheme="minorHAnsi" w:cs="Times New Roman"/>
         <w:kern w:val="2"/>
         <w:sz w:val="24"/>
         <w:szCs w:val="24"/>
         <w:lang w:val="en-US" w:eastAsia="en-US" w:bidi="ar-SA"/>
-        <w14:ligatures w14:val="standardContextual"/>
       </w:rPr>
     </w:rPrDefault>
     <w:pPrDefault>
@@ -3361,57 +3630,13 @@
     <w:lsdException w:name="HTML Sample" w:semiHidden="1" w:unhideWhenUsed="1"/>
     <w:lsdException w:name="HTML Typewriter" w:semiHidden="1" w:unhideWhenUsed="1"/>
     <w:lsdException w:name="HTML Variable" w:semiHidden="1" w:unhideWhenUsed="1"/>
-    <w:lsdException w:name="Normal Table" w:semiHidden="1" w:unhideWhenUsed="1"/>
     <w:lsdException w:name="annotation subject" w:semiHidden="1" w:unhideWhenUsed="1"/>
     <w:lsdException w:name="No List" w:semiHidden="1" w:unhideWhenUsed="1"/>
     <w:lsdException w:name="Outline List 1" w:semiHidden="1" w:unhideWhenUsed="1"/>
     <w:lsdException w:name="Outline List 2" w:semiHidden="1" w:unhideWhenUsed="1"/>
     <w:lsdException w:name="Outline List 3" w:semiHidden="1" w:unhideWhenUsed="1"/>
-    <w:lsdException w:name="Table Simple 1" w:semiHidden="1" w:unhideWhenUsed="1"/>
-    <w:lsdException w:name="Table Simple 2" w:semiHidden="1" w:unhideWhenUsed="1"/>
-    <w:lsdException w:name="Table Simple 3" w:semiHidden="1" w:unhideWhenUsed="1"/>
-    <w:lsdException w:name="Table Classic 1" w:semiHidden="1" w:unhideWhenUsed="1"/>
-    <w:lsdException w:name="Table Classic 2" w:semiHidden="1" w:unhideWhenUsed="1"/>
-    <w:lsdException w:name="Table Classic 3" w:semiHidden="1" w:unhideWhenUsed="1"/>
-    <w:lsdException w:name="Table Classic 4" w:semiHidden="1" w:unhideWhenUsed="1"/>
-    <w:lsdException w:name="Table Colorful 1" w:semiHidden="1" w:unhideWhenUsed="1"/>
-    <w:lsdException w:name="Table Colorful 2" w:semiHidden="1" w:unhideWhenUsed="1"/>
-    <w:lsdException w:name="Table Colorful 3" w:semiHidden="1" w:unhideWhenUsed="1"/>
-    <w:lsdException w:name="Table Columns 1" w:semiHidden="1" w:unhideWhenUsed="1"/>
-    <w:lsdException w:name="Table Columns 2" w:semiHidden="1" w:unhideWhenUsed="1"/>
-    <w:lsdException w:name="Table Columns 3" w:semiHidden="1" w:unhideWhenUsed="1"/>
-    <w:lsdException w:name="Table Columns 4" w:semiHidden="1" w:unhideWhenUsed="1"/>
-    <w:lsdException w:name="Table Columns 5" w:semiHidden="1" w:unhideWhenUsed="1"/>
-    <w:lsdException w:name="Table Grid 1" w:semiHidden="1" w:unhideWhenUsed="1"/>
-    <w:lsdException w:name="Table Grid 2" w:semiHidden="1" w:unhideWhenUsed="1"/>
-    <w:lsdException w:name="Table Grid 3" w:semiHidden="1" w:unhideWhenUsed="1"/>
-    <w:lsdException w:name="Table Grid 4" w:semiHidden="1" w:unhideWhenUsed="1"/>
-    <w:lsdException w:name="Table Grid 5" w:semiHidden="1" w:unhideWhenUsed="1"/>
-    <w:lsdException w:name="Table Grid 6" w:semiHidden="1" w:unhideWhenUsed="1"/>
-    <w:lsdException w:name="Table Grid 7" w:semiHidden="1" w:unhideWhenUsed="1"/>
-    <w:lsdException w:name="Table Grid 8" w:semiHidden="1" w:unhideWhenUsed="1"/>
-    <w:lsdException w:name="Table List 1" w:semiHidden="1" w:unhideWhenUsed="1"/>
-    <w:lsdException w:name="Table List 2" w:semiHidden="1" w:unhideWhenUsed="1"/>
-    <w:lsdException w:name="Table List 3" w:semiHidden="1" w:unhideWhenUsed="1"/>
-    <w:lsdException w:name="Table List 4" w:semiHidden="1" w:unhideWhenUsed="1"/>
-    <w:lsdException w:name="Table List 5" w:semiHidden="1" w:unhideWhenUsed="1"/>
-    <w:lsdException w:name="Table List 6" w:semiHidden="1" w:unhideWhenUsed="1"/>
-    <w:lsdException w:name="Table List 7" w:semiHidden="1" w:unhideWhenUsed="1"/>
-    <w:lsdException w:name="Table List 8" w:semiHidden="1" w:unhideWhenUsed="1"/>
-    <w:lsdException w:name="Table 3D effects 1" w:semiHidden="1" w:unhideWhenUsed="1"/>
-    <w:lsdException w:name="Table 3D effects 2" w:semiHidden="1" w:unhideWhenUsed="1"/>
-    <w:lsdException w:name="Table 3D effects 3" w:semiHidden="1" w:unhideWhenUsed="1"/>
-    <w:lsdException w:name="Table Contemporary" w:semiHidden="1" w:unhideWhenUsed="1"/>
-    <w:lsdException w:name="Table Elegant" w:semiHidden="1" w:unhideWhenUsed="1"/>
-    <w:lsdException w:name="Table Professional" w:semiHidden="1" w:unhideWhenUsed="1"/>
-    <w:lsdException w:name="Table Subtle 1" w:semiHidden="1" w:unhideWhenUsed="1"/>
-    <w:lsdException w:name="Table Subtle 2" w:semiHidden="1" w:unhideWhenUsed="1"/>
-    <w:lsdException w:name="Table Web 1" w:semiHidden="1" w:unhideWhenUsed="1"/>
-    <w:lsdException w:name="Table Web 2" w:semiHidden="1" w:unhideWhenUsed="1"/>
-    <w:lsdException w:name="Table Web 3" w:semiHidden="1" w:unhideWhenUsed="1"/>
     <w:lsdException w:name="Balloon Text" w:semiHidden="1" w:unhideWhenUsed="1"/>
     <w:lsdException w:name="Table Grid" w:uiPriority="39"/>
-    <w:lsdException w:name="Table Theme" w:semiHidden="1" w:unhideWhenUsed="1"/>
     <w:lsdException w:name="Placeholder Text" w:semiHidden="1"/>
     <w:lsdException w:name="No Spacing" w:uiPriority="1" w:qFormat="1"/>
     <w:lsdException w:name="Light Shading" w:uiPriority="60"/>

</xml_diff>